<commit_message>
Fix personal repository chenchen path
</commit_message>
<xml_diff>
--- a/chenchen/docs/两版产品迭代与店主持续使用设计.docx
+++ b/chenchen/docs/两版产品迭代与店主持续使用设计.docx
@@ -35,7 +35,7 @@
     </w:p>
     <w:p>
       <w:r>
-        <w:t>保留“让每一个人，都拥有自己的基金经理”的产品方向，在同一本地服务中提供两个独立入口。投资版加强数字可信度与运行证据；店主版围绕“先把账看明白，再决定下一步”建立账单、现金日期和提醒之间的联系。</w:t>
+        <w:t>保留“让每一个人，都拥有自己的基金经理”的产品方向，本次交付拆成两个独立产品。它们共用本地服务的运行能力，但拥有各自的品牌、首屏重点和使用路径：投资版先看风险与改进方案；店主版先看余额与账单，再进入现金安排。</w:t>
       </w:r>
     </w:p>
     <w:tbl>
@@ -327,7 +327,7 @@
     </w:p>
     <w:p>
       <w:r>
-        <w:t>第 2 页看投资版改动；第 3—4 页看店主账单与使用流程；第 5 页看持续使用设计；第 6 页看修改过程与职责边界；第 7 页看验证与限制；第 8 页看运行和资料来源。</w:t>
+        <w:t>第 2 页看投资版改动；第 3—4 页看店主账单与使用流程；第 5 页看持续使用设计；第 6 页看修改过程与职责边界；第 7 页看验证与限制；第 8 页看运行和资料来源。页面设计按“首屏突出重点、点击进入详情”组织。</w:t>
       </w:r>
     </w:p>
     <w:p>
@@ -346,7 +346,7 @@
     </w:p>
     <w:p>
       <w:r>
-        <w:t>新入口由后台真实计算生成诊断与方案表，原始静态素材保留用于对照。分析流程仍停在团队风控交接点，不冒充已完成审批或真实成交。</w:t>
+        <w:t>新入口由后台真实计算生成诊断与方案表，原始静态素材保留用于对照。界面改成独立的投资顾问产品：首屏先展示风险结果，A/B/C 方案以卡片突出，曲线、目标权重和运行证据收进可展开详情。分析流程仍停在团队风控交接点，不冒充已完成审批或真实成交。</w:t>
       </w:r>
     </w:p>
     <w:tbl>
@@ -2306,7 +2306,7 @@
                 <w:b w:val="0"/>
                 <w:sz w:val="20"/>
               </w:rPr>
-              <w:t>区分当前余额、待到账与待付款。</w:t>
+              <w:t>首屏突出当前余额、待到账、待付款和首个缺口。</w:t>
             </w:r>
           </w:p>
         </w:tc>
@@ -2330,7 +2330,7 @@
                 <w:b w:val="0"/>
                 <w:sz w:val="20"/>
               </w:rPr>
-              <w:t>已结算款不会再被加到当前余额。</w:t>
+              <w:t>已结算款不会再被加到当前余额；完整日历收进详情。</w:t>
             </w:r>
           </w:p>
         </w:tc>
@@ -2383,7 +2383,7 @@
                 <w:b w:val="0"/>
                 <w:sz w:val="20"/>
               </w:rPr>
-              <w:t>按渠道、状态和关键字筛选，点击“看账单”。</w:t>
+              <w:t>首屏先给三张账单卡；需要时展开筛选和完整账单，点击“看账单”。</w:t>
             </w:r>
           </w:p>
         </w:tc>
@@ -3762,7 +3762,7 @@
                 <w:b w:val="0"/>
                 <w:sz w:val="20"/>
               </w:rPr>
-              <w:t>一次性报告不足以支持继续核对。</w:t>
+              <w:t>一次性报告不足以支持继续核对；信息过多也会掩盖关键数字。</w:t>
             </w:r>
           </w:p>
         </w:tc>
@@ -3786,7 +3786,7 @@
                 <w:b w:val="0"/>
                 <w:sz w:val="20"/>
               </w:rPr>
-              <w:t>关注排序、已查看标记、筛选、导入、手动导出。</w:t>
+              <w:t>两个产品分别建立重点卡片、可展开详情、关注排序、已查看标记、筛选、导入和手动导出。</w:t>
             </w:r>
           </w:p>
         </w:tc>

</xml_diff>